<commit_message>
Lock model download dependencies and refine cover sheet
</commit_message>
<xml_diff>
--- a/submission/KrishnaTandon_230911516_FGAI_Assignment3.docx
+++ b/submission/KrishnaTandon_230911516_FGAI_Assignment3.docx
@@ -224,15 +224,6 @@
         </w:tc>
       </w:tr>
     </w:tbl>
-    <w:p/>
-    <w:p>
-      <w:pPr>
-        <w:spacing w:before="120"/>
-      </w:pPr>
-      <w:r>
-        <w:t>The repository contains the implementation, experiment settings, saved predictions, evaluation results, and README.</w:t>
-      </w:r>
-    </w:p>
     <w:sectPr>
       <w:pgSz w:w="12240" w:h="15840"/>
       <w:pgMar w:top="1512" w:right="1584" w:bottom="1296" w:left="1584" w:header="720" w:footer="720" w:gutter="0"/>

</xml_diff>